<commit_message>
Use Jessie's own bullet wording and number format on the Noah CV
Her six base-CV bullets verbatim, four more in the same format. Records
the format rule in writing-preferences so it is not reverted again.

Co-Authored-By: Claude Opus 5.5 <noreply@anthropic.com>
Claude-Session: https://claude.ai/code/session_01Qg3JRGKeFtCXXeV9rGpzwA
</commit_message>
<xml_diff>
--- a/dist/Jessie-Chan-CV-noah-digital.docx
+++ b/dist/Jessie-Chan-CV-noah-digital.docx
@@ -155,7 +155,7 @@
           <w:sz w:val="20"/>
           <w:szCs w:val="20"/>
         </w:rPr>
-        <w:t xml:space="preserve">Scaled paid search from 2 to 26 countries, 9 to 121 campaigns and 47 to 2,597 keywords, growing daily installs ~3x from 187 to 562 while holding CPI flat at ~$1.50</w:t>
+        <w:t xml:space="preserve">Developed an AI-powered UGC production workflow, delivering 100+ video assets across TikTok and Google Ads, increasing CTR from 0.4% to 1.15% (+188%), reducing CPI from $25 to $6 (−76%), and cutting production time by 75%</w:t>
       </w:r>
     </w:p>
     <w:p>
@@ -177,7 +177,7 @@
           <w:sz w:val="20"/>
           <w:szCs w:val="20"/>
         </w:rPr>
-        <w:t xml:space="preserve">Ran 128 structured campaign tests, scaling 5 winning campaign groups and cutting 26 underperformers, which cut UK CPI by 21.5% while installs rose 30.2%</w:t>
+        <w:t xml:space="preserve">Automated daily paid media channels reporting with Claude Code and Cursor, cutting 30 min/day of manual work, and partnered with Data Engineering and Security to publish it as an internal dashboard</w:t>
       </w:r>
     </w:p>
     <w:p>
@@ -199,7 +199,7 @@
           <w:sz w:val="20"/>
           <w:szCs w:val="20"/>
         </w:rPr>
-        <w:t xml:space="preserve">Generated 20+ active leads for Institutional business development by building a 100-operator prospect database, working with B2B Product Marketing on Institutional and Wealth projects</w:t>
+        <w:t xml:space="preserve">Reduced CPI on UK campaigns by 21.5% while installs increased 30.2%, and scaled the core US campaign to 3x daily users acquired through CPP and SKAG testing and optimization</w:t>
       </w:r>
     </w:p>
     <w:p>
@@ -221,7 +221,7 @@
           <w:sz w:val="20"/>
           <w:szCs w:val="20"/>
         </w:rPr>
-        <w:t xml:space="preserve">Sourced 3 major high net worth clients by identifying an acquisition opportunity during the MiCAR transition, building an 80-publisher contact list with AI and running the outreach</w:t>
+        <w:t xml:space="preserve">Built an outreach channel of 80 crypto publishers for high net worth client acquisition that sourced 3 major clients</w:t>
       </w:r>
     </w:p>
     <w:p>
@@ -243,7 +243,7 @@
           <w:sz w:val="20"/>
           <w:szCs w:val="20"/>
         </w:rPr>
-        <w:t xml:space="preserve">Grew cumulative perps trading volume 5x, from $100m to $500m in two months, and user retention by 12% through voice-of-customer research with active, inactive and churned users</w:t>
+        <w:t xml:space="preserve">Supported Retail, Wealth and Institutional growth customer research and prospecting</w:t>
       </w:r>
     </w:p>
     <w:p>
@@ -265,7 +265,7 @@
           <w:sz w:val="20"/>
           <w:szCs w:val="20"/>
         </w:rPr>
-        <w:t xml:space="preserve">Built the company's first in-house AI UGC workflow, delivering 100+ videos, lifting CTR from 0.4% to 1.15% and cutting paid social CPI from $25 to $6 (−76%); its Earn rebrand videos drove 600+ installs in the first week</w:t>
+        <w:t xml:space="preserve">Ran 128 structured campaign tests across 26 countries, identifying 5 scalable campaign groups and reallocating budget away from 26 underperforming campaigns</w:t>
       </w:r>
     </w:p>
     <w:p>
@@ -287,7 +287,7 @@
           <w:sz w:val="20"/>
           <w:szCs w:val="20"/>
         </w:rPr>
-        <w:t xml:space="preserve">Converted 4 high net worth clients onto the loans product in Malaysia within 1 month of launch, leading go-to-market across paid media, KOL, affiliate and referral channels</w:t>
+        <w:t xml:space="preserve">Generated 20+ active leads for Institutional business development by building a 100-operator prospect database</w:t>
       </w:r>
     </w:p>
     <w:p>
@@ -309,7 +309,7 @@
           <w:sz w:val="20"/>
           <w:szCs w:val="20"/>
         </w:rPr>
-        <w:t xml:space="preserve">Localised CRM communications into 24 languages with API tools, increasing email open rate by 10%</w:t>
+        <w:t xml:space="preserve">Grew cumulative perps trading volume 5x from $100m to $500m in two months, and increased user retention by 12% through voice-of-customer research with active, inactive and churned users</w:t>
       </w:r>
     </w:p>
     <w:p>
@@ -331,7 +331,29 @@
           <w:sz w:val="20"/>
           <w:szCs w:val="20"/>
         </w:rPr>
-        <w:t xml:space="preserve">Automated daily performance reporting with Claude Code and led its launch as a company-wide Streamlit dashboard with Data Engineering and Security, saving the team ~10 hours a month</w:t>
+        <w:t xml:space="preserve">Converted 4 high net worth clients onto the loans product in Malaysia within 1 month of launch, running go-to-market across paid media, KOL, affiliate and referral channels</w:t>
+      </w:r>
+    </w:p>
+    <w:p>
+      <w:pPr>
+        <w:pStyle w:val="ListParagraph"/>
+        <w:numPr>
+          <w:ilvl w:val="0"/>
+          <w:numId w:val="2"/>
+        </w:numPr>
+        <w:spacing w:after="50"/>
+      </w:pPr>
+      <w:r>
+        <w:rPr>
+          <w:rFonts w:ascii="Calibri" w:cs="Calibri" w:eastAsia="Calibri" w:hAnsi="Calibri"/>
+          <w:b w:val="false"/>
+          <w:bCs w:val="false"/>
+          <w:i w:val="false"/>
+          <w:iCs w:val="false"/>
+          <w:sz w:val="20"/>
+          <w:szCs w:val="20"/>
+        </w:rPr>
+        <w:t xml:space="preserve">Localised CRM communications into 24 languages with API tools, increasing email open rate by 10%</w:t>
       </w:r>
     </w:p>
     <w:p>

</xml_diff>

<commit_message>
Apply Jessie's Noah bullet list and add the Earn rebrand result back
Co-Authored-By: Claude Opus 5.5 <noreply@anthropic.com>
Claude-Session: https://claude.ai/code/session_01Qg3JRGKeFtCXXeV9rGpzwA
</commit_message>
<xml_diff>
--- a/dist/Jessie-Chan-CV-noah-digital.docx
+++ b/dist/Jessie-Chan-CV-noah-digital.docx
@@ -177,7 +177,7 @@
           <w:sz w:val="20"/>
           <w:szCs w:val="20"/>
         </w:rPr>
-        <w:t xml:space="preserve">Automated daily paid media channels reporting with Claude Code, Cursor and MCP tools, cutting 30 min/day of manual work, and partnered with Data Engineering and Security to publish it as an internal dashboard</w:t>
+        <w:t xml:space="preserve">Recreated the Earn product creative with AI UGC after the Earn rebrand, driving 600+ installs in the first week after relaunch</w:t>
       </w:r>
     </w:p>
     <w:p>
@@ -199,7 +199,7 @@
           <w:sz w:val="20"/>
           <w:szCs w:val="20"/>
         </w:rPr>
-        <w:t xml:space="preserve">Reduced CPI on UK campaigns by 21.5% while installs increased 30.2%, and scaled the core US campaign to 3x daily users acquired through CPP and SKAG testing and optimization</w:t>
+        <w:t xml:space="preserve">Automated daily paid media channels reporting with Claude Code, Cursor and MCP connectors, cutting 30 min/day of manual work, and partnered with Data Engineering and Security to publish it as an internal dashboard</w:t>
       </w:r>
     </w:p>
     <w:p>
@@ -221,7 +221,7 @@
           <w:sz w:val="20"/>
           <w:szCs w:val="20"/>
         </w:rPr>
-        <w:t xml:space="preserve">Built an outreach channel of 80 crypto publishers for high net worth client acquisition that sourced 3 major clients</w:t>
+        <w:t xml:space="preserve">Grew cumulative perps trading volume 5x from $100m to $500m in two months, and increased user retention by 12% through voice-of-customer research with active, inactive and churned users</w:t>
       </w:r>
     </w:p>
     <w:p>
@@ -243,7 +243,7 @@
           <w:sz w:val="20"/>
           <w:szCs w:val="20"/>
         </w:rPr>
-        <w:t xml:space="preserve">Supported Retail, Wealth and Institutional growth customer research and prospecting</w:t>
+        <w:t xml:space="preserve">Reduced CPI on UK campaigns by 21.5% while installs increased 30.2%, and scaled the core US campaign to 3x daily users acquired through CPP and SKAG testing and optimization</w:t>
       </w:r>
     </w:p>
     <w:p>
@@ -265,7 +265,7 @@
           <w:sz w:val="20"/>
           <w:szCs w:val="20"/>
         </w:rPr>
-        <w:t xml:space="preserve">Ran 128 structured campaign tests across 26 countries, identifying 5 scalable campaign groups and reallocating budget away from 26 underperforming campaigns</w:t>
+        <w:t xml:space="preserve">Built an outreach channel of 80 crypto publishers for high net worth client acquisition that sourced 3 major clients</w:t>
       </w:r>
     </w:p>
     <w:p>
@@ -288,28 +288,6 @@
           <w:szCs w:val="20"/>
         </w:rPr>
         <w:t xml:space="preserve">Generated 20+ active leads for Institutional business development by building a 100-operator prospect database</w:t>
-      </w:r>
-    </w:p>
-    <w:p>
-      <w:pPr>
-        <w:pStyle w:val="ListParagraph"/>
-        <w:numPr>
-          <w:ilvl w:val="0"/>
-          <w:numId w:val="2"/>
-        </w:numPr>
-        <w:spacing w:after="50"/>
-      </w:pPr>
-      <w:r>
-        <w:rPr>
-          <w:rFonts w:ascii="Calibri" w:cs="Calibri" w:eastAsia="Calibri" w:hAnsi="Calibri"/>
-          <w:b w:val="false"/>
-          <w:bCs w:val="false"/>
-          <w:i w:val="false"/>
-          <w:iCs w:val="false"/>
-          <w:sz w:val="20"/>
-          <w:szCs w:val="20"/>
-        </w:rPr>
-        <w:t xml:space="preserve">Grew cumulative perps trading volume 5x from $100m to $500m in two months, and increased user retention by 12% through voice-of-customer research with active, inactive and churned users</w:t>
       </w:r>
     </w:p>
     <w:p>

</xml_diff>

<commit_message>
Apply Jessie's final Noah CV, ordered by impact and relevance
Co-Authored-By: Claude Opus 5.5 <noreply@anthropic.com>
Claude-Session: https://claude.ai/code/session_01Qg3JRGKeFtCXXeV9rGpzwA
</commit_message>
<xml_diff>
--- a/dist/Jessie-Chan-CV-noah-digital.docx
+++ b/dist/Jessie-Chan-CV-noah-digital.docx
@@ -177,7 +177,7 @@
           <w:sz w:val="20"/>
           <w:szCs w:val="20"/>
         </w:rPr>
-        <w:t xml:space="preserve">Recreated the Earn product creative with AI UGC after the Earn rebrand, driving 600+ installs in the first week after relaunch</w:t>
+        <w:t xml:space="preserve">Generated 20+ active leads for Institutional business development by building a 100-operator prospect database</w:t>
       </w:r>
     </w:p>
     <w:p>
@@ -199,7 +199,7 @@
           <w:sz w:val="20"/>
           <w:szCs w:val="20"/>
         </w:rPr>
-        <w:t xml:space="preserve">Automated daily paid media channels reporting with Claude Code, Cursor and MCP connectors, cutting 30 min/day of manual work, and partnered with Data Engineering and Security to publish it as an internal dashboard</w:t>
+        <w:t xml:space="preserve">Built an outreach channel of 80 crypto publishers for high net worth client acquisition that sourced 3 major clients</w:t>
       </w:r>
     </w:p>
     <w:p>
@@ -221,7 +221,7 @@
           <w:sz w:val="20"/>
           <w:szCs w:val="20"/>
         </w:rPr>
-        <w:t xml:space="preserve">Grew cumulative perps trading volume 5x from $100m to $500m in two months, and increased user retention by 12% through voice-of-customer research with active, inactive and churned users</w:t>
+        <w:t xml:space="preserve">Converted 4 high net worth clients onto the loans product in Malaysia within 1 month of launch, running go-to-market across paid media, affiliate and referral channels</w:t>
       </w:r>
     </w:p>
     <w:p>
@@ -243,7 +243,7 @@
           <w:sz w:val="20"/>
           <w:szCs w:val="20"/>
         </w:rPr>
-        <w:t xml:space="preserve">Reduced CPI on UK campaigns by 21.5% while installs increased 30.2%, and scaled the core US campaign to 3x daily users acquired through CPP and SKAG testing and optimization</w:t>
+        <w:t xml:space="preserve">Grew cumulative perps trading volume from $100m to $500m in two months, and increased user retention by 12% through voice-of-customer research with active, inactive and churned users</w:t>
       </w:r>
     </w:p>
     <w:p>
@@ -265,7 +265,7 @@
           <w:sz w:val="20"/>
           <w:szCs w:val="20"/>
         </w:rPr>
-        <w:t xml:space="preserve">Built an outreach channel of 80 crypto publishers for high net worth client acquisition that sourced 3 major clients</w:t>
+        <w:t xml:space="preserve">Automated daily paid media channels reporting with Claude Code, Cursor and MCP connectors, cutting 30 min/day of manual work, and partnered with Data Engineering and Security to publish it as an internal dashboard</w:t>
       </w:r>
     </w:p>
     <w:p>
@@ -287,7 +287,7 @@
           <w:sz w:val="20"/>
           <w:szCs w:val="20"/>
         </w:rPr>
-        <w:t xml:space="preserve">Generated 20+ active leads for Institutional business development by building a 100-operator prospect database</w:t>
+        <w:t xml:space="preserve">Reduced CPI on UK campaigns by 21.5% while installs increased 30.2%, and scaled the core US campaign to 3x daily users acquired through CPP and SKAG testing and optimization</w:t>
       </w:r>
     </w:p>
     <w:p>
@@ -309,7 +309,7 @@
           <w:sz w:val="20"/>
           <w:szCs w:val="20"/>
         </w:rPr>
-        <w:t xml:space="preserve">Converted 4 high net worth clients onto the loans product in Malaysia within 1 month of launch, running go-to-market across paid media, KOL, affiliate and referral channels</w:t>
+        <w:t xml:space="preserve">Implemented built-in API in CRM tools to localise communications into 24 languages, increasing email open rate by 10%</w:t>
       </w:r>
     </w:p>
     <w:p>
@@ -331,7 +331,7 @@
           <w:sz w:val="20"/>
           <w:szCs w:val="20"/>
         </w:rPr>
-        <w:t xml:space="preserve">Localised CRM communications into 24 languages with API tools, increasing email open rate by 10%</w:t>
+        <w:t xml:space="preserve">Recreated the Earn product creative with AI UGC after the Earn rebrand, driving 600+ installs in the first week after relaunch</w:t>
       </w:r>
     </w:p>
     <w:p>

</xml_diff>